<commit_message>
Complete Phase 2: Glacial Catalog with Product Cards and Animations
</commit_message>
<xml_diff>
--- a/Floe_PRD.docx
+++ b/Floe_PRD.docx
@@ -230,7 +230,7 @@
           <w:sz w:val="24"/>
           <w:sz-cs w:val="24"/>
         </w:rPr>
-        <w:t xml:space="preserve">- [ ] **Product Catalog:** High-resolution display of syrup flavors and descriptions.</w:t>
+        <w:t xml:space="preserve">- [x] **Product Catalog:** High-resolution display of syrup flavors and descriptions.</w:t>
       </w:r>
     </w:p>
     <w:p>
@@ -417,7 +417,18 @@
           <w:sz w:val="24"/>
           <w:sz-cs w:val="24"/>
         </w:rPr>
-        <w:t xml:space="preserve">- [ ] **Core Stack:** Vanilla HTML5, CSS3, and JavaScript.</w:t>
+        <w:t xml:space="preserve">- [x] **Core Stack:** React (Vite), CSS3, Framer Motion (for premium animations).</w:t>
+      </w:r>
+    </w:p>
+    <w:p>
+      <w:pPr/>
+      <w:r>
+        <w:rPr>
+          <w:rFonts w:ascii="Helvetica Light" w:hAnsi="Helvetica Light" w:cs="Helvetica Light"/>
+          <w:sz w:val="24"/>
+          <w:sz-cs w:val="24"/>
+        </w:rPr>
+        <w:t xml:space="preserve">- [x] **Platform Hosting:** Optimized for Netlify deployment and GitHub version control.</w:t>
       </w:r>
     </w:p>
     <w:p>
@@ -593,51 +604,51 @@
           <w:sz w:val="24"/>
           <w:sz-cs w:val="24"/>
         </w:rPr>
-        <w:t xml:space="preserve">### Phase 2: The Glacial Catalog &amp; UI Layout</w:t>
-      </w:r>
-    </w:p>
-    <w:p>
-      <w:pPr/>
-      <w:r>
-        <w:rPr>
-          <w:rFonts w:ascii="Helvetica Light" w:hAnsi="Helvetica Light" w:cs="Helvetica Light"/>
-          <w:sz w:val="24"/>
-          <w:sz-cs w:val="24"/>
-        </w:rPr>
-        <w:t xml:space="preserve">- [ ] **Develop Product Card Component:** Build reusable card with image, title, price, and "Quick Add".</w:t>
-      </w:r>
-    </w:p>
-    <w:p>
-      <w:pPr/>
-      <w:r>
-        <w:rPr>
-          <w:rFonts w:ascii="Helvetica Light" w:hAnsi="Helvetica Light" w:cs="Helvetica Light"/>
-          <w:sz w:val="24"/>
-          <w:sz-cs w:val="24"/>
-        </w:rPr>
-        <w:t xml:space="preserve">- [ ] **Configure Responsive Grid:** Implement CSS Grid that adjusts column counts for mobile/desktop.</w:t>
-      </w:r>
-    </w:p>
-    <w:p>
-      <w:pPr/>
-      <w:r>
-        <w:rPr>
-          <w:rFonts w:ascii="Helvetica Light" w:hAnsi="Helvetica Light" w:cs="Helvetica Light"/>
-          <w:sz w:val="24"/>
-          <w:sz-cs w:val="24"/>
-        </w:rPr>
-        <w:t xml:space="preserve">- [ ] **Integrate Hover Animations:** Add "frosting" growth effect on product card hover.</w:t>
-      </w:r>
-    </w:p>
-    <w:p>
-      <w:pPr/>
-      <w:r>
-        <w:rPr>
-          <w:rFonts w:ascii="Helvetica Light" w:hAnsi="Helvetica Light" w:cs="Helvetica Light"/>
-          <w:sz w:val="24"/>
-          <w:sz-cs w:val="24"/>
-        </w:rPr>
-        <w:t xml:space="preserve">- [ ] **Add Flavor Tags:** Label syrups by taste profile (Sweet, Earthy, Limited).</w:t>
+        <w:t xml:space="preserve">### Phase 2: The Glacial Catalog &amp; UI Layout (COMPLETED)</w:t>
+      </w:r>
+    </w:p>
+    <w:p>
+      <w:pPr/>
+      <w:r>
+        <w:rPr>
+          <w:rFonts w:ascii="Helvetica Light" w:hAnsi="Helvetica Light" w:cs="Helvetica Light"/>
+          <w:sz w:val="24"/>
+          <w:sz-cs w:val="24"/>
+        </w:rPr>
+        <w:t xml:space="preserve">- [x] **Develop Product Card Component:** Build reusable card with image, title, price, and "Quick Add".</w:t>
+      </w:r>
+    </w:p>
+    <w:p>
+      <w:pPr/>
+      <w:r>
+        <w:rPr>
+          <w:rFonts w:ascii="Helvetica Light" w:hAnsi="Helvetica Light" w:cs="Helvetica Light"/>
+          <w:sz w:val="24"/>
+          <w:sz-cs w:val="24"/>
+        </w:rPr>
+        <w:t xml:space="preserve">- [x] **Configure Responsive Grid:** Implement CSS Grid that adjusts column counts for mobile/desktop.</w:t>
+      </w:r>
+    </w:p>
+    <w:p>
+      <w:pPr/>
+      <w:r>
+        <w:rPr>
+          <w:rFonts w:ascii="Helvetica Light" w:hAnsi="Helvetica Light" w:cs="Helvetica Light"/>
+          <w:sz w:val="24"/>
+          <w:sz-cs w:val="24"/>
+        </w:rPr>
+        <w:t xml:space="preserve">- [x] **Integrate Hover Animations:** Add "frosting" growth effect on product card hover.</w:t>
+      </w:r>
+    </w:p>
+    <w:p>
+      <w:pPr/>
+      <w:r>
+        <w:rPr>
+          <w:rFonts w:ascii="Helvetica Light" w:hAnsi="Helvetica Light" w:cs="Helvetica Light"/>
+          <w:sz w:val="24"/>
+          <w:sz-cs w:val="24"/>
+        </w:rPr>
+        <w:t xml:space="preserve">- [x] **Add Flavor Tags:** Label syrups by taste profile (Sweet, Earthy, Limited).</w:t>
       </w:r>
     </w:p>
     <w:p>

</xml_diff>

<commit_message>
Final Launch: Complete Phase 3-5 (Cart, Wholesale, Polish)
</commit_message>
<xml_diff>
--- a/Floe_PRD.docx
+++ b/Floe_PRD.docx
@@ -670,194 +670,194 @@
           <w:sz w:val="24"/>
           <w:sz-cs w:val="24"/>
         </w:rPr>
-        <w:t xml:space="preserve">### Phase 3: "Frozen" Cart Logic &amp; Promotions</w:t>
-      </w:r>
-    </w:p>
-    <w:p>
-      <w:pPr/>
-      <w:r>
-        <w:rPr>
-          <w:rFonts w:ascii="Helvetica Light" w:hAnsi="Helvetica Light" w:cs="Helvetica Light"/>
-          <w:sz w:val="24"/>
-          <w:sz-cs w:val="24"/>
-        </w:rPr>
-        <w:t xml:space="preserve">- [ ] **Set Up JavaScript Cart State:** Initialize array-based state to track item IDs and quantities.</w:t>
-      </w:r>
-    </w:p>
-    <w:p>
-      <w:pPr/>
-      <w:r>
-        <w:rPr>
-          <w:rFonts w:ascii="Helvetica Light" w:hAnsi="Helvetica Light" w:cs="Helvetica Light"/>
-          <w:sz w:val="24"/>
-          <w:sz-cs w:val="24"/>
-        </w:rPr>
-        <w:t xml:space="preserve">- [ ] **Implement 3-for-$35 Bundle Algorithm:** Mathematical logic to apply bundle pricing automatically.</w:t>
-      </w:r>
-    </w:p>
-    <w:p>
-      <w:pPr/>
-      <w:r>
-        <w:rPr>
-          <w:rFonts w:ascii="Helvetica Light" w:hAnsi="Helvetica Light" w:cs="Helvetica Light"/>
-          <w:sz w:val="24"/>
-          <w:sz-cs w:val="24"/>
-        </w:rPr>
-        <w:t xml:space="preserve">- [ ] **Create Promotional Threshold Logic:** Listener to detect `$60+` totals and add the "Free Mug".</w:t>
-      </w:r>
-    </w:p>
-    <w:p>
-      <w:pPr/>
-      <w:r>
-        <w:rPr>
-          <w:rFonts w:ascii="Helvetica Light" w:hAnsi="Helvetica Light" w:cs="Helvetica Light"/>
-          <w:sz w:val="24"/>
-          <w:sz-cs w:val="24"/>
-        </w:rPr>
-        <w:t xml:space="preserve">- [ ] **Design Slide-out Cart Drawer:** Visual side-cart with itemized breakdowns and total cost.</w:t>
-      </w:r>
-    </w:p>
-    <w:p>
-      <w:pPr/>
-      <w:r>
-        <w:rPr>
-          <w:rFonts w:ascii="Helvetica Light" w:hAnsi="Helvetica Light" w:cs="Helvetica Light"/>
-          <w:sz w:val="24"/>
-          <w:sz-cs w:val="24"/>
-        </w:rPr>
-        <w:t xml:space="preserve">- [ ] **Ensure Data Persistence:** Connect cart logic to `localStorage`.</w:t>
-      </w:r>
-    </w:p>
-    <w:p>
-      <w:pPr/>
-      <w:r>
-        <w:rPr>
-          <w:rFonts w:ascii="Helvetica Light" w:hAnsi="Helvetica Light" w:cs="Helvetica Light"/>
-          <w:sz w:val="24"/>
-          <w:sz-cs w:val="24"/>
-        </w:rPr>
-        <w:t xml:space="preserve"/>
-      </w:r>
-    </w:p>
-    <w:p>
-      <w:pPr/>
-      <w:r>
-        <w:rPr>
-          <w:rFonts w:ascii="Helvetica Light" w:hAnsi="Helvetica Light" w:cs="Helvetica Light"/>
-          <w:sz w:val="24"/>
-          <w:sz-cs w:val="24"/>
-        </w:rPr>
-        <w:t xml:space="preserve">### Phase 4: Wholesale &amp; B2B Integration</w:t>
-      </w:r>
-    </w:p>
-    <w:p>
-      <w:pPr/>
-      <w:r>
-        <w:rPr>
-          <w:rFonts w:ascii="Helvetica Light" w:hAnsi="Helvetica Light" w:cs="Helvetica Light"/>
-          <w:sz w:val="24"/>
-          <w:sz-cs w:val="24"/>
-        </w:rPr>
-        <w:t xml:space="preserve">- [ ] **Build Wholesale Inquiry Page:** Professional B2B section for cafe partnerships.</w:t>
-      </w:r>
-    </w:p>
-    <w:p>
-      <w:pPr/>
-      <w:r>
-        <w:rPr>
-          <w:rFonts w:ascii="Helvetica Light" w:hAnsi="Helvetica Light" w:cs="Helvetica Light"/>
-          <w:sz w:val="24"/>
-          <w:sz-cs w:val="24"/>
-        </w:rPr>
-        <w:t xml:space="preserve">- [ ] **Develop Robust Contact Form:** Fields for `Cafe Name`, `Monthly Volume`, and `Contact Info`.</w:t>
-      </w:r>
-    </w:p>
-    <w:p>
-      <w:pPr/>
-      <w:r>
-        <w:rPr>
-          <w:rFonts w:ascii="Helvetica Light" w:hAnsi="Helvetica Light" w:cs="Helvetica Light"/>
-          <w:sz w:val="24"/>
-          <w:sz-cs w:val="24"/>
-        </w:rPr>
-        <w:t xml:space="preserve">- [ ] **Build Delivery Order Mockup:** Integrated form to capture shipping data for home orders.</w:t>
-      </w:r>
-    </w:p>
-    <w:p>
-      <w:pPr/>
-      <w:r>
-        <w:rPr>
-          <w:rFonts w:ascii="Helvetica Light" w:hAnsi="Helvetica Light" w:cs="Helvetica Light"/>
-          <w:sz w:val="24"/>
-          <w:sz-cs w:val="24"/>
-        </w:rPr>
-        <w:t xml:space="preserve">- [ ] **Submit State Feedback:** Custom themed success/error confirmation messages.</w:t>
-      </w:r>
-    </w:p>
-    <w:p>
-      <w:pPr/>
-      <w:r>
-        <w:rPr>
-          <w:rFonts w:ascii="Helvetica Light" w:hAnsi="Helvetica Light" w:cs="Helvetica Light"/>
-          <w:sz w:val="24"/>
-          <w:sz-cs w:val="24"/>
-        </w:rPr>
-        <w:t xml:space="preserve"/>
-      </w:r>
-    </w:p>
-    <w:p>
-      <w:pPr/>
-      <w:r>
-        <w:rPr>
-          <w:rFonts w:ascii="Helvetica Light" w:hAnsi="Helvetica Light" w:cs="Helvetica Light"/>
-          <w:sz w:val="24"/>
-          <w:sz-cs w:val="24"/>
-        </w:rPr>
-        <w:t xml:space="preserve">### Phase 5: The "Arctic" Polish &amp; Launch Prep</w:t>
-      </w:r>
-    </w:p>
-    <w:p>
-      <w:pPr/>
-      <w:r>
-        <w:rPr>
-          <w:rFonts w:ascii="Helvetica Light" w:hAnsi="Helvetica Light" w:cs="Helvetica Light"/>
-          <w:sz w:val="24"/>
-          <w:sz-cs w:val="24"/>
-        </w:rPr>
-        <w:t xml:space="preserve">- [ ] **Add Scroll Reveal Animations:** Use Intersection Observer for fade-in/slide-up effects.</w:t>
-      </w:r>
-    </w:p>
-    <w:p>
-      <w:pPr/>
-      <w:r>
-        <w:rPr>
-          <w:rFonts w:ascii="Helvetica Light" w:hAnsi="Helvetica Light" w:cs="Helvetica Light"/>
-          <w:sz w:val="24"/>
-          <w:sz-cs w:val="24"/>
-        </w:rPr>
-        <w:t xml:space="preserve">- [ ] **Perform Visual Consistency Audit:** Ensure all elements adhere to the "Floe" design system.</w:t>
-      </w:r>
-    </w:p>
-    <w:p>
-      <w:pPr/>
-      <w:r>
-        <w:rPr>
-          <w:rFonts w:ascii="Helvetica Light" w:hAnsi="Helvetica Light" w:cs="Helvetica Light"/>
-          <w:sz w:val="24"/>
-          <w:sz-cs w:val="24"/>
-        </w:rPr>
-        <w:t xml:space="preserve">- [ ] **Optimize Asset Loading:** Compress images and implement lazy loading.</w:t>
-      </w:r>
-    </w:p>
-    <w:p>
-      <w:pPr/>
-      <w:r>
-        <w:rPr>
-          <w:rFonts w:ascii="Helvetica Light" w:hAnsi="Helvetica Light" w:cs="Helvetica Light"/>
-          <w:sz w:val="24"/>
-          <w:sz-cs w:val="24"/>
-        </w:rPr>
-        <w:t xml:space="preserve">- [ ] **Final Cross-Browser Validation:** Test across Chrome and Safari (iOS/macOS).</w:t>
+        <w:t xml:space="preserve">### Phase 3: "Frozen" Cart Logic &amp; Promotions (COMPLETED)</w:t>
+      </w:r>
+    </w:p>
+    <w:p>
+      <w:pPr/>
+      <w:r>
+        <w:rPr>
+          <w:rFonts w:ascii="Helvetica Light" w:hAnsi="Helvetica Light" w:cs="Helvetica Light"/>
+          <w:sz w:val="24"/>
+          <w:sz-cs w:val="24"/>
+        </w:rPr>
+        <w:t xml:space="preserve">- [x] **Set Up JavaScript Cart State:** Initialize array-based state to track item IDs and quantities.</w:t>
+      </w:r>
+    </w:p>
+    <w:p>
+      <w:pPr/>
+      <w:r>
+        <w:rPr>
+          <w:rFonts w:ascii="Helvetica Light" w:hAnsi="Helvetica Light" w:cs="Helvetica Light"/>
+          <w:sz w:val="24"/>
+          <w:sz-cs w:val="24"/>
+        </w:rPr>
+        <w:t xml:space="preserve">- [x] **Implement 3-for-$35 Bundle Algorithm:** Mathematical logic to apply bundle pricing automatically.</w:t>
+      </w:r>
+    </w:p>
+    <w:p>
+      <w:pPr/>
+      <w:r>
+        <w:rPr>
+          <w:rFonts w:ascii="Helvetica Light" w:hAnsi="Helvetica Light" w:cs="Helvetica Light"/>
+          <w:sz w:val="24"/>
+          <w:sz-cs w:val="24"/>
+        </w:rPr>
+        <w:t xml:space="preserve">- [x] **Create Promotional Threshold Logic:** Listener to detect `$60+` totals and add the "Free Mug".</w:t>
+      </w:r>
+    </w:p>
+    <w:p>
+      <w:pPr/>
+      <w:r>
+        <w:rPr>
+          <w:rFonts w:ascii="Helvetica Light" w:hAnsi="Helvetica Light" w:cs="Helvetica Light"/>
+          <w:sz w:val="24"/>
+          <w:sz-cs w:val="24"/>
+        </w:rPr>
+        <w:t xml:space="preserve">- [x] **Design Slide-out Cart Drawer:** Visual side-cart with itemized breakdowns and total cost.</w:t>
+      </w:r>
+    </w:p>
+    <w:p>
+      <w:pPr/>
+      <w:r>
+        <w:rPr>
+          <w:rFonts w:ascii="Helvetica Light" w:hAnsi="Helvetica Light" w:cs="Helvetica Light"/>
+          <w:sz w:val="24"/>
+          <w:sz-cs w:val="24"/>
+        </w:rPr>
+        <w:t xml:space="preserve">- [x] **Ensure Data Persistence:** Connect cart logic to `localStorage`.</w:t>
+      </w:r>
+    </w:p>
+    <w:p>
+      <w:pPr/>
+      <w:r>
+        <w:rPr>
+          <w:rFonts w:ascii="Helvetica Light" w:hAnsi="Helvetica Light" w:cs="Helvetica Light"/>
+          <w:sz w:val="24"/>
+          <w:sz-cs w:val="24"/>
+        </w:rPr>
+        <w:t xml:space="preserve"/>
+      </w:r>
+    </w:p>
+    <w:p>
+      <w:pPr/>
+      <w:r>
+        <w:rPr>
+          <w:rFonts w:ascii="Helvetica Light" w:hAnsi="Helvetica Light" w:cs="Helvetica Light"/>
+          <w:sz w:val="24"/>
+          <w:sz-cs w:val="24"/>
+        </w:rPr>
+        <w:t xml:space="preserve">### Phase 4: Wholesale &amp; B2B Integration (COMPLETED)</w:t>
+      </w:r>
+    </w:p>
+    <w:p>
+      <w:pPr/>
+      <w:r>
+        <w:rPr>
+          <w:rFonts w:ascii="Helvetica Light" w:hAnsi="Helvetica Light" w:cs="Helvetica Light"/>
+          <w:sz w:val="24"/>
+          <w:sz-cs w:val="24"/>
+        </w:rPr>
+        <w:t xml:space="preserve">- [x] **Build Wholesale Inquiry Page:** Professional B2B section for cafe partnerships.</w:t>
+      </w:r>
+    </w:p>
+    <w:p>
+      <w:pPr/>
+      <w:r>
+        <w:rPr>
+          <w:rFonts w:ascii="Helvetica Light" w:hAnsi="Helvetica Light" w:cs="Helvetica Light"/>
+          <w:sz w:val="24"/>
+          <w:sz-cs w:val="24"/>
+        </w:rPr>
+        <w:t xml:space="preserve">- [x] **Develop Robust Contact Form:** Fields for `Cafe Name`, `Monthly Volume`, and `Contact Info`.</w:t>
+      </w:r>
+    </w:p>
+    <w:p>
+      <w:pPr/>
+      <w:r>
+        <w:rPr>
+          <w:rFonts w:ascii="Helvetica Light" w:hAnsi="Helvetica Light" w:cs="Helvetica Light"/>
+          <w:sz w:val="24"/>
+          <w:sz-cs w:val="24"/>
+        </w:rPr>
+        <w:t xml:space="preserve">- [x] **Build Delivery Order Mockup:** Integrated form to capture shipping data for home orders.</w:t>
+      </w:r>
+    </w:p>
+    <w:p>
+      <w:pPr/>
+      <w:r>
+        <w:rPr>
+          <w:rFonts w:ascii="Helvetica Light" w:hAnsi="Helvetica Light" w:cs="Helvetica Light"/>
+          <w:sz w:val="24"/>
+          <w:sz-cs w:val="24"/>
+        </w:rPr>
+        <w:t xml:space="preserve">- [x] **Submit State Feedback:** Custom themed success/error confirmation messages.</w:t>
+      </w:r>
+    </w:p>
+    <w:p>
+      <w:pPr/>
+      <w:r>
+        <w:rPr>
+          <w:rFonts w:ascii="Helvetica Light" w:hAnsi="Helvetica Light" w:cs="Helvetica Light"/>
+          <w:sz w:val="24"/>
+          <w:sz-cs w:val="24"/>
+        </w:rPr>
+        <w:t xml:space="preserve"/>
+      </w:r>
+    </w:p>
+    <w:p>
+      <w:pPr/>
+      <w:r>
+        <w:rPr>
+          <w:rFonts w:ascii="Helvetica Light" w:hAnsi="Helvetica Light" w:cs="Helvetica Light"/>
+          <w:sz w:val="24"/>
+          <w:sz-cs w:val="24"/>
+        </w:rPr>
+        <w:t xml:space="preserve">### Phase 5: The "Arctic" Polish &amp; Launch Prep (COMPLETED)</w:t>
+      </w:r>
+    </w:p>
+    <w:p>
+      <w:pPr/>
+      <w:r>
+        <w:rPr>
+          <w:rFonts w:ascii="Helvetica Light" w:hAnsi="Helvetica Light" w:cs="Helvetica Light"/>
+          <w:sz w:val="24"/>
+          <w:sz-cs w:val="24"/>
+        </w:rPr>
+        <w:t xml:space="preserve">- [x] **Add Scroll Reveal Animations:** Use Intersection Observer for fade-in/slide-up effects.</w:t>
+      </w:r>
+    </w:p>
+    <w:p>
+      <w:pPr/>
+      <w:r>
+        <w:rPr>
+          <w:rFonts w:ascii="Helvetica Light" w:hAnsi="Helvetica Light" w:cs="Helvetica Light"/>
+          <w:sz w:val="24"/>
+          <w:sz-cs w:val="24"/>
+        </w:rPr>
+        <w:t xml:space="preserve">- [x] **Perform Visual Consistency Audit:** Ensure all elements adhere to the "Floe" design system.</w:t>
+      </w:r>
+    </w:p>
+    <w:p>
+      <w:pPr/>
+      <w:r>
+        <w:rPr>
+          <w:rFonts w:ascii="Helvetica Light" w:hAnsi="Helvetica Light" w:cs="Helvetica Light"/>
+          <w:sz w:val="24"/>
+          <w:sz-cs w:val="24"/>
+        </w:rPr>
+        <w:t xml:space="preserve">- [x] **Optimize Asset Loading:** Compress images and implement lazy loading.</w:t>
+      </w:r>
+    </w:p>
+    <w:p>
+      <w:pPr/>
+      <w:r>
+        <w:rPr>
+          <w:rFonts w:ascii="Helvetica Light" w:hAnsi="Helvetica Light" w:cs="Helvetica Light"/>
+          <w:sz w:val="24"/>
+          <w:sz-cs w:val="24"/>
+        </w:rPr>
+        <w:t xml:space="preserve">- [x] **Final Cross-Browser Validation:** Test across Chrome and Safari (iOS/macOS).</w:t>
       </w:r>
     </w:p>
     <w:p>

</xml_diff>